<commit_message>
Started inputting the text inside of the tex file (again text subject to change)
</commit_message>
<xml_diff>
--- a/Sections (word)/III. research methodologies.docx
+++ b/Sections (word)/III. research methodologies.docx
@@ -1,19 +1,17 @@
 
 <file path=word/document.xml><?xml version="1.0" encoding="utf-8"?>
-<w:document xmlns:wpc="http://schemas.microsoft.com/office/word/2010/wordprocessingCanvas" xmlns:cx="http://schemas.microsoft.com/office/drawing/2014/chartex" xmlns:cx1="http://schemas.microsoft.com/office/drawing/2015/9/8/chartex" xmlns:cx2="http://schemas.microsoft.com/office/drawing/2015/10/21/chartex" xmlns:cx3="http://schemas.microsoft.com/office/drawing/2016/5/9/chartex" xmlns:cx4="http://schemas.microsoft.com/office/drawing/2016/5/10/chartex" xmlns:cx5="http://schemas.microsoft.com/office/drawing/2016/5/11/chartex" xmlns:cx6="http://schemas.microsoft.com/office/drawing/2016/5/12/chartex" xmlns:cx7="http://schemas.microsoft.com/office/drawing/2016/5/13/chartex" xmlns:cx8="http://schemas.microsoft.com/office/drawing/2016/5/14/chartex" xmlns:mc="http://schemas.openxmlformats.org/markup-compatibility/2006" xmlns:aink="http://schemas.microsoft.com/office/drawing/2016/ink" xmlns:am3d="http://schemas.microsoft.com/office/drawing/2017/model3d" xmlns:o="urn:schemas-microsoft-com:office:office" xmlns:oel="http://schemas.microsoft.com/office/2019/extlst" xmlns:r="http://schemas.openxmlformats.org/officeDocument/2006/relationships" xmlns:m="http://schemas.openxmlformats.org/officeDocument/2006/math" xmlns:v="urn:schemas-microsoft-com:vml" xmlns:wp14="http://schemas.microsoft.com/office/word/2010/wordprocessingDrawing" xmlns:wp="http://schemas.openxmlformats.org/drawingml/2006/wordprocessingDrawing" xmlns:w10="urn:schemas-microsoft-com:office:word" xmlns:w="http://schemas.openxmlformats.org/wordprocessingml/2006/main" xmlns:w14="http://schemas.microsoft.com/office/word/2010/wordml" xmlns:w15="http://schemas.microsoft.com/office/word/2012/wordml" xmlns:w16cex="http://schemas.microsoft.com/office/word/2018/wordml/cex" xmlns:w16cid="http://schemas.microsoft.com/office/word/2016/wordml/cid" xmlns:w16="http://schemas.microsoft.com/office/word/2018/wordml" xmlns:w16du="http://schemas.microsoft.com/office/word/2023/wordml/word16du" xmlns:w16sdtdh="http://schemas.microsoft.com/office/word/2020/wordml/sdtdatahash" xmlns:w16sdtfl="http://schemas.microsoft.com/office/word/2024/wordml/sdtformatlock" xmlns:w16se="http://schemas.microsoft.com/office/word/2015/wordml/symex" xmlns:wpg="http://schemas.microsoft.com/office/word/2010/wordprocessingGroup" xmlns:wpi="http://schemas.microsoft.com/office/word/2010/wordprocessingInk" xmlns:wne="http://schemas.microsoft.com/office/word/2006/wordml" xmlns:wps="http://schemas.microsoft.com/office/word/2010/wordprocessingShape" mc:Ignorable="w14 w15 w16se w16cid w16 w16cex w16sdtdh w16sdtfl w16du wp14">
+<w:document xmlns:wpc="http://schemas.microsoft.com/office/word/2010/wordprocessingCanvas" xmlns:cx="http://schemas.microsoft.com/office/drawing/2014/chartex" xmlns:cx1="http://schemas.microsoft.com/office/drawing/2015/9/8/chartex" xmlns:cx2="http://schemas.microsoft.com/office/drawing/2015/10/21/chartex" xmlns:cx3="http://schemas.microsoft.com/office/drawing/2016/5/9/chartex" xmlns:cx4="http://schemas.microsoft.com/office/drawing/2016/5/10/chartex" xmlns:cx5="http://schemas.microsoft.com/office/drawing/2016/5/11/chartex" xmlns:cx6="http://schemas.microsoft.com/office/drawing/2016/5/12/chartex" xmlns:cx7="http://schemas.microsoft.com/office/drawing/2016/5/13/chartex" xmlns:cx8="http://schemas.microsoft.com/office/drawing/2016/5/14/chartex" xmlns:mc="http://schemas.openxmlformats.org/markup-compatibility/2006" xmlns:aink="http://schemas.microsoft.com/office/drawing/2016/ink" xmlns:am3d="http://schemas.microsoft.com/office/drawing/2017/model3d" xmlns:o="urn:schemas-microsoft-com:office:office" xmlns:oel="http://schemas.microsoft.com/office/2019/extlst" xmlns:r="http://schemas.openxmlformats.org/officeDocument/2006/relationships" xmlns:m="http://schemas.openxmlformats.org/officeDocument/2006/math" xmlns:v="urn:schemas-microsoft-com:vml" xmlns:wp14="http://schemas.microsoft.com/office/word/2010/wordprocessingDrawing" xmlns:wp="http://schemas.openxmlformats.org/drawingml/2006/wordprocessingDrawing" xmlns:a="http://schemas.openxmlformats.org/drawingml/2006/main" xmlns:pic="http://schemas.openxmlformats.org/drawingml/2006/picture" xmlns:c="http://schemas.openxmlformats.org/drawingml/2006/chart" xmlns:dgm="http://schemas.openxmlformats.org/drawingml/2006/diagram" xmlns:lc="http://schemas.openxmlformats.org/drawingml/2006/lockedCanvas" xmlns:w10="urn:schemas-microsoft-com:office:word" xmlns:w="http://schemas.openxmlformats.org/wordprocessingml/2006/main" xmlns:w14="http://schemas.microsoft.com/office/word/2010/wordml" xmlns:w15="http://schemas.microsoft.com/office/word/2012/wordml" xmlns:w16cex="http://schemas.microsoft.com/office/word/2018/wordml/cex" xmlns:w16cid="http://schemas.microsoft.com/office/word/2016/wordml/cid" xmlns:w16="http://schemas.microsoft.com/office/word/2018/wordml" xmlns:w16du="http://schemas.microsoft.com/office/word/2023/wordml/word16du" xmlns:w16sdtdh="http://schemas.microsoft.com/office/word/2020/wordml/sdtdatahash" xmlns:w16sdtfl="http://schemas.microsoft.com/office/word/2024/wordml/sdtformatlock" xmlns:w16se="http://schemas.microsoft.com/office/word/2015/wordml/symex" xmlns:wpg="http://schemas.microsoft.com/office/word/2010/wordprocessingGroup" xmlns:wpi="http://schemas.microsoft.com/office/word/2010/wordprocessingInk" xmlns:wne="http://schemas.microsoft.com/office/word/2006/wordml" xmlns:wps="http://schemas.microsoft.com/office/word/2010/wordprocessingShape" mc:Ignorable="w14 w15 w16se w16cid w16 w16cex w16sdtdh w16sdtfl w16du wp14">
   <w:body>
     <w:p>
       <w:pPr>
         <w:spacing w:after="160"/>
         <w:rPr>
-          <w:b/>
-          <w:bCs/>
-        </w:rPr>
-      </w:pPr>
-      <w:r>
-        <w:rPr>
-          <w:b/>
-          <w:bCs/>
+          <w:rFonts w:ascii="Arial" w:hAnsi="Arial" w:eastAsia="Arial" w:cs="Arial"/>
+        </w:rPr>
+      </w:pPr>
+      <w:r>
+        <w:rPr>
+          <w:rFonts w:ascii="Arial" w:hAnsi="Arial" w:eastAsia="Arial" w:cs="Arial"/>
         </w:rPr>
         <w:t>III. RESEARCH METHODOLOGY</w:t>
       </w:r>
@@ -46,11 +44,13 @@
           <w:numId w:val="16"/>
         </w:numPr>
         <w:spacing w:after="160"/>
-      </w:pPr>
-      <w:r>
-        <w:rPr>
-          <w:b/>
-          <w:bCs/>
+        <w:rPr>
+          <w:rFonts w:ascii="Arial" w:hAnsi="Arial" w:eastAsia="Arial" w:cs="Arial"/>
+        </w:rPr>
+      </w:pPr>
+      <w:r>
+        <w:rPr>
+          <w:rFonts w:ascii="Arial" w:hAnsi="Arial" w:eastAsia="Arial" w:cs="Arial"/>
         </w:rPr>
         <w:t>RQ1:</w:t>
       </w:r>
@@ -65,11 +65,13 @@
           <w:numId w:val="16"/>
         </w:numPr>
         <w:spacing w:after="160"/>
-      </w:pPr>
-      <w:r>
-        <w:rPr>
-          <w:b/>
-          <w:bCs/>
+        <w:rPr>
+          <w:rFonts w:ascii="Arial" w:hAnsi="Arial" w:eastAsia="Arial" w:cs="Arial"/>
+        </w:rPr>
+      </w:pPr>
+      <w:r>
+        <w:rPr>
+          <w:rFonts w:ascii="Arial" w:hAnsi="Arial" w:eastAsia="Arial" w:cs="Arial"/>
         </w:rPr>
         <w:t>RQ2:</w:t>
       </w:r>
@@ -84,11 +86,13 @@
           <w:numId w:val="16"/>
         </w:numPr>
         <w:spacing w:after="160"/>
-      </w:pPr>
-      <w:r>
-        <w:rPr>
-          <w:b/>
-          <w:bCs/>
+        <w:rPr>
+          <w:rFonts w:ascii="Arial" w:hAnsi="Arial" w:eastAsia="Arial" w:cs="Arial"/>
+        </w:rPr>
+      </w:pPr>
+      <w:r>
+        <w:rPr>
+          <w:rFonts w:ascii="Arial" w:hAnsi="Arial" w:eastAsia="Arial" w:cs="Arial"/>
         </w:rPr>
         <w:t>RQ3:</w:t>
       </w:r>
@@ -103,11 +107,13 @@
           <w:numId w:val="16"/>
         </w:numPr>
         <w:spacing w:after="160"/>
-      </w:pPr>
-      <w:r>
-        <w:rPr>
-          <w:b/>
-          <w:bCs/>
+        <w:rPr>
+          <w:rFonts w:ascii="Arial" w:hAnsi="Arial" w:eastAsia="Arial" w:cs="Arial"/>
+        </w:rPr>
+      </w:pPr>
+      <w:r>
+        <w:rPr>
+          <w:rFonts w:ascii="Arial" w:hAnsi="Arial" w:eastAsia="Arial" w:cs="Arial"/>
         </w:rPr>
         <w:t>RQ4:</w:t>
       </w:r>
@@ -117,10 +123,6 @@
     </w:p>
     <w:p>
       <w:pPr>
-        <w:numPr>
-          <w:ilvl w:val="0"/>
-          <w:numId w:val="16"/>
-        </w:numPr>
         <w:spacing w:after="160"/>
       </w:pPr>
     </w:p>
@@ -213,7 +215,6 @@
         <w:spacing w:after="160"/>
       </w:pPr>
       <w:r>
-        <w:lastRenderedPageBreak/>
         <w:t>Analyse results using descriptive statistics and comparative analysis to determine whether the observed differences support the hypothesis.</w:t>
       </w:r>
     </w:p>
@@ -226,14 +227,12 @@
       <w:pPr>
         <w:spacing w:after="160"/>
         <w:rPr>
-          <w:b/>
-          <w:bCs/>
-        </w:rPr>
-      </w:pPr>
-      <w:r>
-        <w:rPr>
-          <w:b/>
-          <w:bCs/>
+          <w:rFonts w:ascii="Arial" w:hAnsi="Arial" w:eastAsia="Arial" w:cs="Arial"/>
+        </w:rPr>
+      </w:pPr>
+      <w:r>
+        <w:rPr>
+          <w:rFonts w:ascii="Arial" w:hAnsi="Arial" w:eastAsia="Arial" w:cs="Arial"/>
         </w:rPr>
         <w:t>A. Reflection on Research Philosophy, Approach, and Paradigm</w:t>
       </w:r>
@@ -247,8 +246,7 @@
       </w:r>
       <w:r>
         <w:rPr>
-          <w:b/>
-          <w:bCs/>
+          <w:rFonts w:ascii="Arial" w:hAnsi="Arial" w:eastAsia="Arial" w:cs="Arial"/>
         </w:rPr>
         <w:t>pragmatist</w:t>
       </w:r>
@@ -265,8 +263,7 @@
       </w:r>
       <w:r>
         <w:rPr>
-          <w:b/>
-          <w:bCs/>
+          <w:rFonts w:ascii="Arial" w:hAnsi="Arial" w:eastAsia="Arial" w:cs="Arial"/>
         </w:rPr>
         <w:t>deductive approach</w:t>
       </w:r>
@@ -283,14 +280,12 @@
       <w:pPr>
         <w:spacing w:after="160"/>
         <w:rPr>
-          <w:b/>
-          <w:bCs/>
-        </w:rPr>
-      </w:pPr>
-      <w:r>
-        <w:rPr>
-          <w:b/>
-          <w:bCs/>
+          <w:rFonts w:ascii="Arial" w:hAnsi="Arial" w:eastAsia="Arial" w:cs="Arial"/>
+        </w:rPr>
+      </w:pPr>
+      <w:r>
+        <w:rPr>
+          <w:rFonts w:ascii="Arial" w:hAnsi="Arial" w:eastAsia="Arial" w:cs="Arial"/>
         </w:rPr>
         <w:t>B. Chosen Methodology and Why It Fits the Objectives</w:t>
       </w:r>
@@ -304,8 +299,7 @@
       </w:r>
       <w:r>
         <w:rPr>
-          <w:b/>
-          <w:bCs/>
+          <w:rFonts w:ascii="Arial" w:hAnsi="Arial" w:eastAsia="Arial" w:cs="Arial"/>
         </w:rPr>
         <w:t>controlled software experiment (comparative benchmarking)</w:t>
       </w:r>
@@ -322,8 +316,7 @@
       </w:r>
       <w:r>
         <w:rPr>
-          <w:b/>
-          <w:bCs/>
+          <w:rFonts w:ascii="Arial" w:hAnsi="Arial" w:eastAsia="Arial" w:cs="Arial"/>
         </w:rPr>
         <w:t>mono-method quantitative</w:t>
       </w:r>
@@ -340,8 +333,7 @@
       </w:r>
       <w:r>
         <w:rPr>
-          <w:b/>
-          <w:bCs/>
+          <w:rFonts w:ascii="Arial" w:hAnsi="Arial" w:eastAsia="Arial" w:cs="Arial"/>
         </w:rPr>
         <w:t>cross-sectional with repeated runs</w:t>
       </w:r>
@@ -363,16 +355,13 @@
       <w:pPr>
         <w:spacing w:after="160"/>
         <w:rPr>
-          <w:b/>
-          <w:bCs/>
-        </w:rPr>
-      </w:pPr>
-      <w:r>
-        <w:rPr>
-          <w:b/>
-          <w:bCs/>
-        </w:rPr>
-        <w:lastRenderedPageBreak/>
+          <w:rFonts w:ascii="Arial" w:hAnsi="Arial" w:eastAsia="Arial" w:cs="Arial"/>
+        </w:rPr>
+      </w:pPr>
+      <w:r>
+        <w:rPr>
+          <w:rFonts w:ascii="Arial" w:hAnsi="Arial" w:eastAsia="Arial" w:cs="Arial"/>
+        </w:rPr>
         <w:t>C. Environment and Technologies Used</w:t>
       </w:r>
     </w:p>
@@ -385,8 +374,7 @@
       </w:r>
       <w:r>
         <w:rPr>
-          <w:b/>
-          <w:bCs/>
+          <w:rFonts w:ascii="Arial" w:hAnsi="Arial" w:eastAsia="Arial" w:cs="Arial"/>
         </w:rPr>
         <w:t>FastAPI (Python)</w:t>
       </w:r>
@@ -395,8 +383,7 @@
       </w:r>
       <w:r>
         <w:rPr>
-          <w:b/>
-          <w:bCs/>
+          <w:rFonts w:ascii="Arial" w:hAnsi="Arial" w:eastAsia="Arial" w:cs="Arial"/>
         </w:rPr>
         <w:t>PostgreSQL</w:t>
       </w:r>
@@ -474,25 +461,19 @@
     </w:p>
     <w:p>
       <w:pPr>
-        <w:numPr>
-          <w:ilvl w:val="0"/>
-          <w:numId w:val="18"/>
-        </w:numPr>
-        <w:spacing w:after="160"/>
-      </w:pPr>
-    </w:p>
-    <w:p>
-      <w:pPr>
-        <w:spacing w:after="160"/>
-        <w:rPr>
-          <w:b/>
-          <w:bCs/>
-        </w:rPr>
-      </w:pPr>
-      <w:r>
-        <w:rPr>
-          <w:b/>
-          <w:bCs/>
+        <w:spacing w:after="160"/>
+      </w:pPr>
+    </w:p>
+    <w:p>
+      <w:pPr>
+        <w:spacing w:after="160"/>
+        <w:rPr>
+          <w:rFonts w:ascii="Arial" w:hAnsi="Arial" w:eastAsia="Arial" w:cs="Arial"/>
+        </w:rPr>
+      </w:pPr>
+      <w:r>
+        <w:rPr>
+          <w:rFonts w:ascii="Arial" w:hAnsi="Arial" w:eastAsia="Arial" w:cs="Arial"/>
         </w:rPr>
         <w:t>D. Experiment Design</w:t>
       </w:r>
@@ -501,14 +482,12 @@
       <w:pPr>
         <w:spacing w:after="160"/>
         <w:rPr>
-          <w:b/>
-          <w:bCs/>
-        </w:rPr>
-      </w:pPr>
-      <w:r>
-        <w:rPr>
-          <w:b/>
-          <w:bCs/>
+          <w:rFonts w:ascii="Arial" w:hAnsi="Arial" w:eastAsia="Arial" w:cs="Arial"/>
+        </w:rPr>
+      </w:pPr>
+      <w:r>
+        <w:rPr>
+          <w:rFonts w:ascii="Arial" w:hAnsi="Arial" w:eastAsia="Arial" w:cs="Arial"/>
         </w:rPr>
         <w:t>1) Artefacts and Conditions</w:t>
       </w:r>
@@ -528,16 +507,20 @@
           <w:numId w:val="19"/>
         </w:numPr>
         <w:spacing w:after="160"/>
-      </w:pPr>
-      <w:r>
-        <w:rPr>
-          <w:b/>
-          <w:bCs/>
+        <w:rPr>
+          <w:rFonts w:ascii="Arial" w:hAnsi="Arial" w:eastAsia="Arial" w:cs="Arial"/>
+        </w:rPr>
+      </w:pPr>
+      <w:r>
+        <w:rPr>
+          <w:rFonts w:ascii="Arial" w:hAnsi="Arial" w:eastAsia="Arial" w:cs="Arial"/>
         </w:rPr>
         <w:t>Architecture A: Monolith</w:t>
       </w:r>
       <w:r>
         <w:br/>
+      </w:r>
+      <w:r>
         <w:t>A single backend structure where routing, business rules, and data access are closely integrated.</w:t>
       </w:r>
     </w:p>
@@ -548,16 +531,20 @@
           <w:numId w:val="19"/>
         </w:numPr>
         <w:spacing w:after="160"/>
-      </w:pPr>
-      <w:r>
-        <w:rPr>
-          <w:b/>
-          <w:bCs/>
+        <w:rPr>
+          <w:rFonts w:ascii="Arial" w:hAnsi="Arial" w:eastAsia="Arial" w:cs="Arial"/>
+        </w:rPr>
+      </w:pPr>
+      <w:r>
+        <w:rPr>
+          <w:rFonts w:ascii="Arial" w:hAnsi="Arial" w:eastAsia="Arial" w:cs="Arial"/>
         </w:rPr>
         <w:t>Architecture B: Modular or layered</w:t>
       </w:r>
       <w:r>
         <w:br/>
+      </w:r>
+      <w:r>
         <w:t>A design using clear boundaries such as router → service → repository, separating concerns and aiming to reduce coupling.</w:t>
       </w:r>
     </w:p>
@@ -570,14 +557,12 @@
       <w:pPr>
         <w:spacing w:after="160"/>
         <w:rPr>
-          <w:b/>
-          <w:bCs/>
-        </w:rPr>
-      </w:pPr>
-      <w:r>
-        <w:rPr>
-          <w:b/>
-          <w:bCs/>
+          <w:rFonts w:ascii="Arial" w:hAnsi="Arial" w:eastAsia="Arial" w:cs="Arial"/>
+        </w:rPr>
+      </w:pPr>
+      <w:r>
+        <w:rPr>
+          <w:rFonts w:ascii="Arial" w:hAnsi="Arial" w:eastAsia="Arial" w:cs="Arial"/>
         </w:rPr>
         <w:t>2) Fairness Controls (Study Design)</w:t>
       </w:r>
@@ -635,7 +620,6 @@
         <w:spacing w:after="160"/>
       </w:pPr>
       <w:r>
-        <w:lastRenderedPageBreak/>
         <w:t>Same environment and repeated-run procedures.</w:t>
       </w:r>
     </w:p>
@@ -668,14 +652,12 @@
       <w:pPr>
         <w:spacing w:after="160"/>
         <w:rPr>
-          <w:b/>
-          <w:bCs/>
-        </w:rPr>
-      </w:pPr>
-      <w:r>
-        <w:rPr>
-          <w:b/>
-          <w:bCs/>
+          <w:rFonts w:ascii="Arial" w:hAnsi="Arial" w:eastAsia="Arial" w:cs="Arial"/>
+        </w:rPr>
+      </w:pPr>
+      <w:r>
+        <w:rPr>
+          <w:rFonts w:ascii="Arial" w:hAnsi="Arial" w:eastAsia="Arial" w:cs="Arial"/>
         </w:rPr>
         <w:t>3) Independent and Dependent Variables</w:t>
       </w:r>
@@ -683,11 +665,13 @@
     <w:p>
       <w:pPr>
         <w:spacing w:after="160"/>
-      </w:pPr>
-      <w:r>
-        <w:rPr>
-          <w:b/>
-          <w:bCs/>
+        <w:rPr>
+          <w:rFonts w:ascii="Arial" w:hAnsi="Arial" w:eastAsia="Arial" w:cs="Arial"/>
+        </w:rPr>
+      </w:pPr>
+      <w:r>
+        <w:rPr>
+          <w:rFonts w:ascii="Arial" w:hAnsi="Arial" w:eastAsia="Arial" w:cs="Arial"/>
         </w:rPr>
         <w:t>Independent variable:</w:t>
       </w:r>
@@ -707,11 +691,13 @@
     <w:p>
       <w:pPr>
         <w:spacing w:after="160"/>
-      </w:pPr>
-      <w:r>
-        <w:rPr>
-          <w:b/>
-          <w:bCs/>
+        <w:rPr>
+          <w:rFonts w:ascii="Arial" w:hAnsi="Arial" w:eastAsia="Arial" w:cs="Arial"/>
+        </w:rPr>
+      </w:pPr>
+      <w:r>
+        <w:rPr>
+          <w:rFonts w:ascii="Arial" w:hAnsi="Arial" w:eastAsia="Arial" w:cs="Arial"/>
         </w:rPr>
         <w:t>Dependent variables:</w:t>
       </w:r>
@@ -723,11 +709,13 @@
           <w:numId w:val="22"/>
         </w:numPr>
         <w:spacing w:after="160"/>
-      </w:pPr>
-      <w:r>
-        <w:rPr>
-          <w:b/>
-          <w:bCs/>
+        <w:rPr>
+          <w:rFonts w:ascii="Arial" w:hAnsi="Arial" w:eastAsia="Arial" w:cs="Arial"/>
+        </w:rPr>
+      </w:pPr>
+      <w:r>
+        <w:rPr>
+          <w:rFonts w:ascii="Arial" w:hAnsi="Arial" w:eastAsia="Arial" w:cs="Arial"/>
         </w:rPr>
         <w:t>Maintainability and structure:</w:t>
       </w:r>
@@ -742,11 +730,13 @@
           <w:numId w:val="22"/>
         </w:numPr>
         <w:spacing w:after="160"/>
-      </w:pPr>
-      <w:r>
-        <w:rPr>
-          <w:b/>
-          <w:bCs/>
+        <w:rPr>
+          <w:rFonts w:ascii="Arial" w:hAnsi="Arial" w:eastAsia="Arial" w:cs="Arial"/>
+        </w:rPr>
+      </w:pPr>
+      <w:r>
+        <w:rPr>
+          <w:rFonts w:ascii="Arial" w:hAnsi="Arial" w:eastAsia="Arial" w:cs="Arial"/>
         </w:rPr>
         <w:t>Testability:</w:t>
       </w:r>
@@ -761,11 +751,13 @@
           <w:numId w:val="22"/>
         </w:numPr>
         <w:spacing w:after="160"/>
-      </w:pPr>
-      <w:r>
-        <w:rPr>
-          <w:b/>
-          <w:bCs/>
+        <w:rPr>
+          <w:rFonts w:ascii="Arial" w:hAnsi="Arial" w:eastAsia="Arial" w:cs="Arial"/>
+        </w:rPr>
+      </w:pPr>
+      <w:r>
+        <w:rPr>
+          <w:rFonts w:ascii="Arial" w:hAnsi="Arial" w:eastAsia="Arial" w:cs="Arial"/>
         </w:rPr>
         <w:t>Operational performance:</w:t>
       </w:r>
@@ -780,11 +772,13 @@
           <w:numId w:val="22"/>
         </w:numPr>
         <w:spacing w:after="160"/>
-      </w:pPr>
-      <w:r>
-        <w:rPr>
-          <w:b/>
-          <w:bCs/>
+        <w:rPr>
+          <w:rFonts w:ascii="Arial" w:hAnsi="Arial" w:eastAsia="Arial" w:cs="Arial"/>
+        </w:rPr>
+      </w:pPr>
+      <w:r>
+        <w:rPr>
+          <w:rFonts w:ascii="Arial" w:hAnsi="Arial" w:eastAsia="Arial" w:cs="Arial"/>
         </w:rPr>
         <w:t>Change impact:</w:t>
       </w:r>
@@ -801,14 +795,12 @@
       <w:pPr>
         <w:spacing w:after="160"/>
         <w:rPr>
-          <w:b/>
-          <w:bCs/>
-        </w:rPr>
-      </w:pPr>
-      <w:r>
-        <w:rPr>
-          <w:b/>
-          <w:bCs/>
+          <w:rFonts w:ascii="Arial" w:hAnsi="Arial" w:eastAsia="Arial" w:cs="Arial"/>
+        </w:rPr>
+      </w:pPr>
+      <w:r>
+        <w:rPr>
+          <w:rFonts w:ascii="Arial" w:hAnsi="Arial" w:eastAsia="Arial" w:cs="Arial"/>
         </w:rPr>
         <w:t>4) Controlled Change Request Experiment</w:t>
       </w:r>
@@ -830,14 +822,12 @@
       <w:pPr>
         <w:spacing w:after="160"/>
         <w:rPr>
-          <w:b/>
-          <w:bCs/>
-        </w:rPr>
-      </w:pPr>
-      <w:r>
-        <w:rPr>
-          <w:b/>
-          <w:bCs/>
+          <w:rFonts w:ascii="Arial" w:hAnsi="Arial" w:eastAsia="Arial" w:cs="Arial"/>
+        </w:rPr>
+      </w:pPr>
+      <w:r>
+        <w:rPr>
+          <w:rFonts w:ascii="Arial" w:hAnsi="Arial" w:eastAsia="Arial" w:cs="Arial"/>
         </w:rPr>
         <w:t>E. Method of Analysis</w:t>
       </w:r>
@@ -857,11 +847,13 @@
           <w:numId w:val="23"/>
         </w:numPr>
         <w:spacing w:after="160"/>
-      </w:pPr>
-      <w:r>
-        <w:rPr>
-          <w:b/>
-          <w:bCs/>
+        <w:rPr>
+          <w:rFonts w:ascii="Arial" w:hAnsi="Arial" w:eastAsia="Arial" w:cs="Arial"/>
+        </w:rPr>
+      </w:pPr>
+      <w:r>
+        <w:rPr>
+          <w:rFonts w:ascii="Arial" w:hAnsi="Arial" w:eastAsia="Arial" w:cs="Arial"/>
         </w:rPr>
         <w:t>Descriptive statistics</w:t>
       </w:r>
@@ -876,11 +868,13 @@
           <w:numId w:val="23"/>
         </w:numPr>
         <w:spacing w:after="160"/>
-      </w:pPr>
-      <w:r>
-        <w:rPr>
-          <w:b/>
-          <w:bCs/>
+        <w:rPr>
+          <w:rFonts w:ascii="Arial" w:hAnsi="Arial" w:eastAsia="Arial" w:cs="Arial"/>
+        </w:rPr>
+      </w:pPr>
+      <w:r>
+        <w:rPr>
+          <w:rFonts w:ascii="Arial" w:hAnsi="Arial" w:eastAsia="Arial" w:cs="Arial"/>
         </w:rPr>
         <w:t>Repeated-run aggregation</w:t>
       </w:r>
@@ -895,13 +889,14 @@
           <w:numId w:val="23"/>
         </w:numPr>
         <w:spacing w:after="160"/>
-      </w:pPr>
-      <w:r>
-        <w:rPr>
-          <w:b/>
-          <w:bCs/>
-        </w:rPr>
-        <w:lastRenderedPageBreak/>
+        <w:rPr>
+          <w:rFonts w:ascii="Arial" w:hAnsi="Arial" w:eastAsia="Arial" w:cs="Arial"/>
+        </w:rPr>
+      </w:pPr>
+      <w:r>
+        <w:rPr>
+          <w:rFonts w:ascii="Arial" w:hAnsi="Arial" w:eastAsia="Arial" w:cs="Arial"/>
+        </w:rPr>
         <w:t>Comparative interpretation</w:t>
       </w:r>
       <w:r>
@@ -937,14 +932,12 @@
       <w:pPr>
         <w:spacing w:after="160"/>
         <w:rPr>
-          <w:b/>
-          <w:bCs/>
-        </w:rPr>
-      </w:pPr>
-      <w:r>
-        <w:rPr>
-          <w:b/>
-          <w:bCs/>
+          <w:rFonts w:ascii="Arial" w:hAnsi="Arial" w:eastAsia="Arial" w:cs="Arial"/>
+        </w:rPr>
+      </w:pPr>
+      <w:r>
+        <w:rPr>
+          <w:rFonts w:ascii="Arial" w:hAnsi="Arial" w:eastAsia="Arial" w:cs="Arial"/>
         </w:rPr>
         <w:t>F. Reflections on Validity, Reliability, and Generalisability</w:t>
       </w:r>
@@ -952,11 +945,13 @@
     <w:p>
       <w:pPr>
         <w:spacing w:after="160"/>
-      </w:pPr>
-      <w:r>
-        <w:rPr>
-          <w:b/>
-          <w:bCs/>
+        <w:rPr>
+          <w:rFonts w:ascii="Arial" w:hAnsi="Arial" w:eastAsia="Arial" w:cs="Arial"/>
+        </w:rPr>
+      </w:pPr>
+      <w:r>
+        <w:rPr>
+          <w:rFonts w:ascii="Arial" w:hAnsi="Arial" w:eastAsia="Arial" w:cs="Arial"/>
         </w:rPr>
         <w:t>Internal validity:</w:t>
       </w:r>
@@ -967,11 +962,13 @@
     <w:p>
       <w:pPr>
         <w:spacing w:after="160"/>
-      </w:pPr>
-      <w:r>
-        <w:rPr>
-          <w:b/>
-          <w:bCs/>
+        <w:rPr>
+          <w:rFonts w:ascii="Arial" w:hAnsi="Arial" w:eastAsia="Arial" w:cs="Arial"/>
+        </w:rPr>
+      </w:pPr>
+      <w:r>
+        <w:rPr>
+          <w:rFonts w:ascii="Arial" w:hAnsi="Arial" w:eastAsia="Arial" w:cs="Arial"/>
         </w:rPr>
         <w:t>Construct validity:</w:t>
       </w:r>
@@ -982,11 +979,13 @@
     <w:p>
       <w:pPr>
         <w:spacing w:after="160"/>
-      </w:pPr>
-      <w:r>
-        <w:rPr>
-          <w:b/>
-          <w:bCs/>
+        <w:rPr>
+          <w:rFonts w:ascii="Arial" w:hAnsi="Arial" w:eastAsia="Arial" w:cs="Arial"/>
+        </w:rPr>
+      </w:pPr>
+      <w:r>
+        <w:rPr>
+          <w:rFonts w:ascii="Arial" w:hAnsi="Arial" w:eastAsia="Arial" w:cs="Arial"/>
         </w:rPr>
         <w:t>Reliability:</w:t>
       </w:r>
@@ -997,11 +996,13 @@
     <w:p>
       <w:pPr>
         <w:spacing w:after="160"/>
-      </w:pPr>
-      <w:r>
-        <w:rPr>
-          <w:b/>
-          <w:bCs/>
+        <w:rPr>
+          <w:rFonts w:ascii="Arial" w:hAnsi="Arial" w:eastAsia="Arial" w:cs="Arial"/>
+        </w:rPr>
+      </w:pPr>
+      <w:r>
+        <w:rPr>
+          <w:rFonts w:ascii="Arial" w:hAnsi="Arial" w:eastAsia="Arial" w:cs="Arial"/>
         </w:rPr>
         <w:t>Generalisability and transferability:</w:t>
       </w:r>
@@ -1018,14 +1019,12 @@
       <w:pPr>
         <w:spacing w:after="160"/>
         <w:rPr>
-          <w:b/>
-          <w:bCs/>
-        </w:rPr>
-      </w:pPr>
-      <w:r>
-        <w:rPr>
-          <w:b/>
-          <w:bCs/>
+          <w:rFonts w:ascii="Arial" w:hAnsi="Arial" w:eastAsia="Arial" w:cs="Arial"/>
+        </w:rPr>
+      </w:pPr>
+      <w:r>
+        <w:rPr>
+          <w:rFonts w:ascii="Arial" w:hAnsi="Arial" w:eastAsia="Arial" w:cs="Arial"/>
         </w:rPr>
         <w:t>G. Ethical Considerations</w:t>
       </w:r>
@@ -1043,7 +1042,6 @@
         <w:spacing w:after="160"/>
       </w:pPr>
       <w:r>
-        <w:lastRenderedPageBreak/>
         <w:t>Ethical considerations mainly relate to research integrity and transparency. The study will report methodology, controls, and limitations clearly to avoid overstating conclusions, particularly given that architecture research often involves proxy measures and correlation-based evidence in the wider literature [3], [11]. Results will be presented objectively, including cases where findings do not support the hypothesis. Where third-party tools are used for measurement, the study will acknowledge tool limitations and avoid claiming certainty beyond what the metrics support [1], [8].</w:t>
       </w:r>
     </w:p>
@@ -1181,7 +1179,7 @@
               <v:stroke joinstyle="miter"/>
               <v:path gradientshapeok="t" o:connecttype="rect"/>
             </v:shapetype>
-            <v:shape id="Text Box 2" o:spid="_x0000_s1026" type="#_x0000_t202" alt="Classified as Internal" style="position:absolute;margin-left:0;margin-top:0;width:92.55pt;height:26.7pt;z-index:251659264;visibility:visible;mso-wrap-style:none;mso-wrap-distance-left:0;mso-wrap-distance-top:0;mso-wrap-distance-right:0;mso-wrap-distance-bottom:0;mso-position-horizontal:left;mso-position-horizontal-relative:page;mso-position-vertical:bottom;mso-position-vertical-relative:page;v-text-anchor:bottom" o:gfxdata="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" filled="f" stroked="f">
+            <v:shape id="Text Box 2" o:spid="_x0000_s1026" type="#_x0000_t202" alt="Classified as Internal" style="position:absolute;margin-left:0;margin-top:0;width:92.55pt;height:26.7pt;z-index:251659264;visibility:visible;mso-wrap-style:none;mso-wrap-distance-left:0;mso-wrap-distance-top:0;mso-wrap-distance-right:0;mso-wrap-distance-bottom:0;mso-position-horizontal:left;mso-position-horizontal-relative:page;mso-position-vertical:bottom;mso-position-vertical-relative:page;v-text-anchor:bottom" o:gfxdata="UEsDBBQABgAIAAAAIQC2gziS/gAAAOEBAAATAAAAW0NvbnRlbnRfVHlwZXNdLnhtbJSRQU7DMBBF 90jcwfIWJU67QAgl6YK0S0CoHGBkTxKLZGx5TGhvj5O2G0SRWNoz/78nu9wcxkFMGNg6quQqL6RA 0s5Y6ir5vt9lD1JwBDIwOMJKHpHlpr69KfdHjyxSmriSfYz+USnWPY7AufNIadK6MEJMx9ApD/oD OlTrorhX2lFEilmcO2RdNtjC5xDF9pCuTyYBB5bi6bQ4syoJ3g9WQ0ymaiLzg5KdCXlKLjvcW893 SUOqXwnz5DrgnHtJTxOsQfEKIT7DmDSUCaxw7Rqn8787ZsmRM9e2VmPeBN4uqYvTtW7jvijg9N/y JsXecLq0q+WD6m8AAAD//wMAUEsDBBQABgAIAAAAIQA4/SH/1gAAAJQBAAALAAAAX3JlbHMvLnJl bHOkkMFqwzAMhu+DvYPRfXGawxijTi+j0GvpHsDYimMaW0Yy2fr2M4PBMnrbUb/Q94l/f/hMi1qR JVI2sOt6UJgd+ZiDgffL8ekFlFSbvV0oo4EbChzGx4f9GRdb25HMsYhqlCwG5lrLq9biZkxWOiqY 22YiTra2kYMu1l1tQD30/bPm3wwYN0x18gb45AdQl1tp5j/sFB2T0FQ7R0nTNEV3j6o9feQzro1i OWA14Fm+Q8a1a8+Bvu/d/dMb2JY5uiPbhG/ktn4cqGU/er3pcvwCAAD//wMAUEsDBBQABgAIAAAA IQDxllHEEAIAABsEAAAOAAAAZHJzL2Uyb0RvYy54bWysU99v2jAQfp+0/8Hy+0iAsZWIULFWTJNQ W4lOfTaOTSLZPss2JOyv39kJsHV7qvriXO7O9+P7Pi9uO63IUTjfgCnpeJRTIgyHqjH7kv58Xn+6 ocQHZiqmwIiSnoSnt8uPHxatLcQEalCVcASLGF+0tqR1CLbIMs9roZkfgRUGgxKcZgF/3T6rHGux ulbZJM+/ZC24yjrgwnv03vdBukz1pRQ8PErpRSCqpDhbSKdL5y6e2XLBir1jtm74MAZ7wxSaNQab Xkrds8DIwTX/lNINd+BBhhEHnYGUDRdpB9xmnL/aZlszK9IuCI63F5j8+5XlD8etfXIkdN+gQwIj IK31hUdn3KeTTscvTkowjhCeLrCJLhAeL42/zqY3M0o4xqbTeT5PuGbX29b58F2AJtEoqUNaElrs uPEBO2LqOSU2M7BulErUKPOXAxOjJ7uOGK3Q7bph7h1UJ1zHQc+0t3zdYM8N8+GJOaQWN0C5hkc8 pIK2pDBYlNTgfv3PH/MRcYxS0qJUSmpQy5SoHwaZmMw+53mUVvpDw52NXTLG83wW4+ag7wBVOMYH YXkyY3JQZ1M60C+o5lXshiFmOPYs6e5s3oVeuPgauFitUhKqyLKwMVvLY+kIVkTyuXthzg5wByTq Ac5iYsUr1PvceNPb1SEg9omSCGyP5oA3KjAxNbyWKPE//1PW9U0vfwMAAP//AwBQSwMEFAAGAAgA AAAhAAEi5S/bAAAABAEAAA8AAABkcnMvZG93bnJldi54bWxMj81uwjAQhO+V+g7WVuqtONASoTQO QvRHvTZUao9OvMQR8TpkDaRvX9MLXFYazWjm23w5uk4cceDWk4LpJAGBVHvTUqPga/P2sADBQZPR nSdU8IsMy+L2JteZ8Sf6xGMZGhFLiDOtwIbQZ1JybdFpnvgeKXpbPzgdohwaaQZ9iuWuk7MkSaXT LcUFq3tcW6x35cEpSF/eV7b/Tn/22xl/cOV3ofSvSt3fjatnEAHHcAnDGT+iQxGZKn8gw6JTEB8J //fsLeZTEJWC+eMTyCKX1/DFHwAAAP//AwBQSwECLQAUAAYACAAAACEAtoM4kv4AAADhAQAAEwAA AAAAAAAAAAAAAAAAAAAAW0NvbnRlbnRfVHlwZXNdLnhtbFBLAQItABQABgAIAAAAIQA4/SH/1gAA AJQBAAALAAAAAAAAAAAAAAAAAC8BAABfcmVscy8ucmVsc1BLAQItABQABgAIAAAAIQDxllHEEAIA ABsEAAAOAAAAAAAAAAAAAAAAAC4CAABkcnMvZTJvRG9jLnhtbFBLAQItABQABgAIAAAAIQABIuUv 2wAAAAQBAAAPAAAAAAAAAAAAAAAAAGoEAABkcnMvZG93bnJldi54bWxQSwUGAAAAAAQABADzAAAA cgUAAAAA " filled="f" stroked="f">
               <v:fill o:detectmouseclick="t"/>
               <v:textbox style="mso-fit-shape-to-text:t" inset="20pt,0,0,15pt">
                 <w:txbxContent>
@@ -1312,7 +1310,7 @@
               <v:stroke joinstyle="miter"/>
               <v:path gradientshapeok="t" o:connecttype="rect"/>
             </v:shapetype>
-            <v:shape id="Text Box 3" o:spid="_x0000_s1027" type="#_x0000_t202" alt="Classified as Internal" style="position:absolute;margin-left:0;margin-top:0;width:92.55pt;height:26.7pt;z-index:251660288;visibility:visible;mso-wrap-style:none;mso-wrap-distance-left:0;mso-wrap-distance-top:0;mso-wrap-distance-right:0;mso-wrap-distance-bottom:0;mso-position-horizontal:left;mso-position-horizontal-relative:page;mso-position-vertical:bottom;mso-position-vertical-relative:page;v-text-anchor:bottom" o:gfxdata="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" filled="f" stroked="f">
+            <v:shape id="Text Box 3" o:spid="_x0000_s1027" type="#_x0000_t202" alt="Classified as Internal" style="position:absolute;margin-left:0;margin-top:0;width:92.55pt;height:26.7pt;z-index:251660288;visibility:visible;mso-wrap-style:none;mso-wrap-distance-left:0;mso-wrap-distance-top:0;mso-wrap-distance-right:0;mso-wrap-distance-bottom:0;mso-position-horizontal:left;mso-position-horizontal-relative:page;mso-position-vertical:bottom;mso-position-vertical-relative:page;v-text-anchor:bottom" o:gfxdata="UEsDBBQABgAIAAAAIQC2gziS/gAAAOEBAAATAAAAW0NvbnRlbnRfVHlwZXNdLnhtbJSRQU7DMBBF 90jcwfIWJU67QAgl6YK0S0CoHGBkTxKLZGx5TGhvj5O2G0SRWNoz/78nu9wcxkFMGNg6quQqL6RA 0s5Y6ir5vt9lD1JwBDIwOMJKHpHlpr69KfdHjyxSmriSfYz+USnWPY7AufNIadK6MEJMx9ApD/oD OlTrorhX2lFEilmcO2RdNtjC5xDF9pCuTyYBB5bi6bQ4syoJ3g9WQ0ymaiLzg5KdCXlKLjvcW893 SUOqXwnz5DrgnHtJTxOsQfEKIT7DmDSUCaxw7Rqn8787ZsmRM9e2VmPeBN4uqYvTtW7jvijg9N/y JsXecLq0q+WD6m8AAAD//wMAUEsDBBQABgAIAAAAIQA4/SH/1gAAAJQBAAALAAAAX3JlbHMvLnJl bHOkkMFqwzAMhu+DvYPRfXGawxijTi+j0GvpHsDYimMaW0Yy2fr2M4PBMnrbUb/Q94l/f/hMi1qR JVI2sOt6UJgd+ZiDgffL8ekFlFSbvV0oo4EbChzGx4f9GRdb25HMsYhqlCwG5lrLq9biZkxWOiqY 22YiTra2kYMu1l1tQD30/bPm3wwYN0x18gb45AdQl1tp5j/sFB2T0FQ7R0nTNEV3j6o9feQzro1i OWA14Fm+Q8a1a8+Bvu/d/dMb2JY5uiPbhG/ktn4cqGU/er3pcvwCAAD//wMAUEsDBBQABgAIAAAA IQCvuoDoEgIAACIEAAAOAAAAZHJzL2Uyb0RvYy54bWysU8tu2zAQvBfoPxC815Lsuo0Fy4GbwEUB IwngFDlTFGkJILkESVtyv75L+pWkPRW9UKvd5T5mhvPbQSuyF853YCpajHJKhOHQdGZb0Z/Pq083 lPjATMMUGFHRg/D0dvHxw7y3pRhDC6oRjmAR48veVrQNwZZZ5nkrNPMjsMJgUILTLOCv22aNYz1W 1yob5/mXrAfXWAdceI/e+2OQLlJ9KQUPj1J6EYiqKM4W0unSWcczW8xZuXXMth0/jcH+YQrNOoNN L6XuWWBk57o/SumOO/Agw4iDzkDKjou0A25T5O+22bTMirQLguPtBSb//8ryh/3GPjkShm8wIIER kN760qMz7jNIp+MXJyUYRwgPF9jEEAiPl4qv08nNlBKOsclkls8Srtn1tnU+fBegSTQq6pCWhBbb r33Ajph6TonNDKw6pRI1yrxxYGL0ZNcRoxWGeiBd82r8GpoDbuXgSLi3fNVh6zXz4Yk5ZBgXQdWG Rzykgr6icLIoacH9+ps/5iPwGKWkR8VU1KCkKVE/DBIynn7O86iw9IeGOxt1MopZPo1xs9N3gGIs 8F1YnsyYHNTZlA70C4p6GbthiBmOPStan827cNQvPgoulsuUhGKyLKzNxvJYOmIWAX0eXpizJ9QD 8vUAZ02x8h34x9x409vlLiAFiZmI7xHNE+woxETY6dFEpb/+T1nXp734DQAA//8DAFBLAwQUAAYA CAAAACEAASLlL9sAAAAEAQAADwAAAGRycy9kb3ducmV2LnhtbEyPzW7CMBCE75X6DtZW6q040BKh NA5C9Ee9NlRqj068xBHxOmQNpG9f0wtcVhrNaObbfDm6Thxx4NaTgukkAYFUe9NSo+Br8/awAMFB k9GdJ1TwiwzL4vYm15nxJ/rEYxkaEUuIM63AhtBnUnJt0Wme+B4pels/OB2iHBppBn2K5a6TsyRJ pdMtxQWre1xbrHflwSlIX95Xtv9Of/bbGX9w5Xeh9K9K3d+Nq2cQAcdwCcMZP6JDEZkqfyDDolMQ Hwn/9+wt5lMQlYL54xPIIpfX8MUfAAAA//8DAFBLAQItABQABgAIAAAAIQC2gziS/gAAAOEBAAAT AAAAAAAAAAAAAAAAAAAAAABbQ29udGVudF9UeXBlc10ueG1sUEsBAi0AFAAGAAgAAAAhADj9If/W AAAAlAEAAAsAAAAAAAAAAAAAAAAALwEAAF9yZWxzLy5yZWxzUEsBAi0AFAAGAAgAAAAhAK+6gOgS AgAAIgQAAA4AAAAAAAAAAAAAAAAALgIAAGRycy9lMm9Eb2MueG1sUEsBAi0AFAAGAAgAAAAhAAEi 5S/bAAAABAEAAA8AAAAAAAAAAAAAAAAAbAQAAGRycy9kb3ducmV2LnhtbFBLBQYAAAAABAAEAPMA AAB0BQAAAAA= " filled="f" stroked="f">
               <v:fill o:detectmouseclick="t"/>
               <v:textbox style="mso-fit-shape-to-text:t" inset="20pt,0,0,15pt">
                 <w:txbxContent>
@@ -1443,7 +1441,7 @@
               <v:stroke joinstyle="miter"/>
               <v:path gradientshapeok="t" o:connecttype="rect"/>
             </v:shapetype>
-            <v:shape id="Text Box 1" o:spid="_x0000_s1028" type="#_x0000_t202" alt="Classified as Internal" style="position:absolute;margin-left:0;margin-top:0;width:92.55pt;height:26.7pt;z-index:251658240;visibility:visible;mso-wrap-style:none;mso-wrap-distance-left:0;mso-wrap-distance-top:0;mso-wrap-distance-right:0;mso-wrap-distance-bottom:0;mso-position-horizontal:left;mso-position-horizontal-relative:page;mso-position-vertical:bottom;mso-position-vertical-relative:page;v-text-anchor:bottom" o:gfxdata="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" filled="f" stroked="f">
+            <v:shape id="Text Box 1" o:spid="_x0000_s1028" type="#_x0000_t202" alt="Classified as Internal" style="position:absolute;margin-left:0;margin-top:0;width:92.55pt;height:26.7pt;z-index:251658240;visibility:visible;mso-wrap-style:none;mso-wrap-distance-left:0;mso-wrap-distance-top:0;mso-wrap-distance-right:0;mso-wrap-distance-bottom:0;mso-position-horizontal:left;mso-position-horizontal-relative:page;mso-position-vertical:bottom;mso-position-vertical-relative:page;v-text-anchor:bottom" o:gfxdata="UEsDBBQABgAIAAAAIQC2gziS/gAAAOEBAAATAAAAW0NvbnRlbnRfVHlwZXNdLnhtbJSRQU7DMBBF 90jcwfIWJU67QAgl6YK0S0CoHGBkTxKLZGx5TGhvj5O2G0SRWNoz/78nu9wcxkFMGNg6quQqL6RA 0s5Y6ir5vt9lD1JwBDIwOMJKHpHlpr69KfdHjyxSmriSfYz+USnWPY7AufNIadK6MEJMx9ApD/oD OlTrorhX2lFEilmcO2RdNtjC5xDF9pCuTyYBB5bi6bQ4syoJ3g9WQ0ymaiLzg5KdCXlKLjvcW893 SUOqXwnz5DrgnHtJTxOsQfEKIT7DmDSUCaxw7Rqn8787ZsmRM9e2VmPeBN4uqYvTtW7jvijg9N/y JsXecLq0q+WD6m8AAAD//wMAUEsDBBQABgAIAAAAIQA4/SH/1gAAAJQBAAALAAAAX3JlbHMvLnJl bHOkkMFqwzAMhu+DvYPRfXGawxijTi+j0GvpHsDYimMaW0Yy2fr2M4PBMnrbUb/Q94l/f/hMi1qR JVI2sOt6UJgd+ZiDgffL8ekFlFSbvV0oo4EbChzGx4f9GRdb25HMsYhqlCwG5lrLq9biZkxWOiqY 22YiTra2kYMu1l1tQD30/bPm3wwYN0x18gb45AdQl1tp5j/sFB2T0FQ7R0nTNEV3j6o9feQzro1i OWA14Fm+Q8a1a8+Bvu/d/dMb2JY5uiPbhG/ktn4cqGU/er3pcvwCAAD//wMAUEsDBBQABgAIAAAA IQD+LHOqFAIAACIEAAAOAAAAZHJzL2Uyb0RvYy54bWysU99v2jAQfp+0/8Hy+0iAsZWIULFWTJNQ W4lOfTaOTSLZPss2JOyv39khsHV7qvriXO7O9+P7Pi9uO63IUTjfgCnpeJRTIgyHqjH7kv58Xn+6 ocQHZiqmwIiSnoSnt8uPHxatLcQEalCVcASLGF+0tqR1CLbIMs9roZkfgRUGgxKcZgF/3T6rHGux ulbZJM+/ZC24yjrgwnv03vdBukz1pRQ8PErpRSCqpDhbSKdL5y6e2XLBir1jtm74eQz2hik0aww2 vZS6Z4GRg2v+KaUb7sCDDCMOOgMpGy7SDrjNOH+1zbZmVqRdEBxvLzD59yvLH45b++RI6L5BhwRG QFrrC4/OuE8nnY5fnJRgHCE8XWATXSA8Xhp/nU1vZpRwjE2n83yecM2ut63z4bsATaJRUoe0JLTY ceMDdsTUISU2M7BulErUKPOXAxOjJ7uOGK3Q7TrSVCWdDOPvoDrhVg56wr3l6wZbb5gPT8whw7gI qjY84iEVtCWFs0VJDe7X//wxH4HHKCUtKqakBiVNifphkJDJ7HOeR4WlPzTcYOySMZ7nsxg3B30H KMYxvgvLkxmTgxpM6UC/oKhXsRuGmOHYs6S7wbwLvX7xUXCxWqUkFJNlYWO2lsfSEbMI6HP3wpw9 ox6QrwcYNMWKV+D3ufGmt6tDQAoSMxHfHs0z7CjERNj50USl//mfsq5Pe/kbAAD//wMAUEsDBBQA BgAIAAAAIQABIuUv2wAAAAQBAAAPAAAAZHJzL2Rvd25yZXYueG1sTI/NbsIwEITvlfoO1lbqrTjQ EqE0DkL0R702VGqPTrzEEfE6ZA2kb1/TC1xWGs1o5tt8ObpOHHHg1pOC6SQBgVR701Kj4Gvz9rAA wUGT0Z0nVPCLDMvi9ibXmfEn+sRjGRoRS4gzrcCG0GdScm3RaZ74Hil6Wz84HaIcGmkGfYrlrpOz JEml0y3FBat7XFusd+XBKUhf3le2/05/9tsZf3Dld6H0r0rd342rZxABx3AJwxk/okMRmSp/IMOi UxAfCf/37C3mUxCVgvnjE8gil9fwxR8AAAD//wMAUEsBAi0AFAAGAAgAAAAhALaDOJL+AAAA4QEA ABMAAAAAAAAAAAAAAAAAAAAAAFtDb250ZW50X1R5cGVzXS54bWxQSwECLQAUAAYACAAAACEAOP0h /9YAAACUAQAACwAAAAAAAAAAAAAAAAAvAQAAX3JlbHMvLnJlbHNQSwECLQAUAAYACAAAACEA/ixz qhQCAAAiBAAADgAAAAAAAAAAAAAAAAAuAgAAZHJzL2Uyb0RvYy54bWxQSwECLQAUAAYACAAAACEA ASLlL9sAAAAEAQAADwAAAAAAAAAAAAAAAABuBAAAZHJzL2Rvd25yZXYueG1sUEsFBgAAAAAEAAQA 8wAAAHYFAAAAAA== " filled="f" stroked="f">
               <v:fill o:detectmouseclick="t"/>
               <v:textbox style="mso-fit-shape-to-text:t" inset="20pt,0,0,15pt">
                 <w:txbxContent>

</xml_diff>